<commit_message>
Strip non-element nodes from every WordprocessingML part, not just the body
Docling walks header and footer parts with the same tag-name lookup that
crashed on the body, so a comment node in a header would have failed the
same way. Parts are reached through the package rather than through
section.header, which would create a header definition where none exists
and change the document Docling sees. The fixture now plants a comment
inside a paragraph and in a header; a second test asserts the invariant
directly: no WML part holds a comment or processing instruction after
stripping, and the count matches what was planted.
</commit_message>
<xml_diff>
--- a/tests/fixtures/xml_comment.docx
+++ b/tests/fixtures/xml_comment.docx
@@ -12,6 +12,7 @@
       </w:r>
     </w:p>
     <w:p>
+      <!--inline marker-->
       <w:r>
         <w:t>Travel costs are reimbursed at the rates in effect on the date the travel began. Receipts are required for any single expense of twenty-five dollars or more. Requests submitted more than sixty days after the end of travel require written justification from the department head.</w:t>
       </w:r>
@@ -32,6 +33,7 @@
       </w:r>
     </w:p>
     <w:sectPr>
+      <w:headerReference w:type="default" r:id="rId9"/>
       <w:pgSz w:w="12240" w:h="15840"/>
       <w:pgMar w:top="1440" w:right="1800" w:bottom="1440" w:left="1800" w:header="720" w:footer="720" w:gutter="0"/>
       <w:cols w:space="720"/>
@@ -39,6 +41,20 @@
     </w:sectPr>
   </w:body>
 </w:document>
+</file>
+
+<file path=word/header1.xml><?xml version="1.0" encoding="utf-8"?>
+<w:hdr xmlns:m="http://schemas.openxmlformats.org/officeDocument/2006/math" xmlns:mc="http://schemas.openxmlformats.org/markup-compatibility/2006" xmlns:mo="http://schemas.microsoft.com/office/mac/office/2008/main" xmlns:mv="urn:schemas-microsoft-com:mac:vml" xmlns:o="urn:schemas-microsoft-com:office:office" xmlns:r="http://schemas.openxmlformats.org/officeDocument/2006/relationships" xmlns:v="urn:schemas-microsoft-com:vml" xmlns:w10="urn:schemas-microsoft-com:office:word" xmlns:w14="http://schemas.microsoft.com/office/word/2010/wordml" xmlns:w="http://schemas.openxmlformats.org/wordprocessingml/2006/main" xmlns:wne="http://schemas.microsoft.com/office/word/2006/wordml" xmlns:wp14="http://schemas.microsoft.com/office/word/2010/wordprocessingDrawing" xmlns:wp="http://schemas.openxmlformats.org/drawingml/2006/wordprocessingDrawing" xmlns:wpc="http://schemas.microsoft.com/office/word/2010/wordprocessingCanvas" xmlns:wpg="http://schemas.microsoft.com/office/word/2010/wordprocessingGroup" xmlns:wpi="http://schemas.microsoft.com/office/word/2010/wordprocessingInk" xmlns:wps="http://schemas.microsoft.com/office/word/2010/wordprocessingShape" mc:Ignorable="w14 wp14">
+  <!--Topic header_1-->
+  <w:p>
+    <w:pPr>
+      <w:pStyle w:val="Header"/>
+    </w:pPr>
+    <w:r>
+      <w:t>Supplement running header</w:t>
+    </w:r>
+  </w:p>
+</w:hdr>
 </file>
 
 <file path=word/numbering.xml><?xml version="1.0" encoding="utf-8"?>

</xml_diff>